<commit_message>
redesign báo cáo, thêm quản lí kho
</commit_message>
<xml_diff>
--- a/docs/atlas/ATL-00_Workflow-he-thong.docx
+++ b/docs/atlas/ATL-00_Workflow-he-thong.docx
@@ -313,7 +313,7 @@
                 <w:sz w:val="19"/>
                 <w:szCs w:val="19"/>
               </w:rPr>
-              <w:t xml:space="preserve">1.0 — 22/10/2026</w:t>
+              <w:t xml:space="preserve">1.1 — 23/10/2026</w:t>
             </w:r>
           </w:p>
         </w:tc>
@@ -450,7 +450,7 @@
           <w:sz w:val="21"/>
           <w:szCs w:val="21"/>
         </w:rPr>
-        <w:t xml:space="preserve">Đây là tài liệu mẹ: mỗi chức năng có một tài liệu Atlas riêng (ATL-01 → ATL-24) mô tả sâu hơn; mục 8 là chỉ mục.</w:t>
+        <w:t xml:space="preserve">Đây là tài liệu mẹ: mỗi chức năng có một tài liệu Atlas riêng (ATL-01 → ATL-27) mô tả sâu hơn; mục 8 là chỉ mục.</w:t>
       </w:r>
     </w:p>
     <w:p>
@@ -715,7 +715,7 @@
           <w:sz w:val="21"/>
           <w:szCs w:val="21"/>
         </w:rPr>
-        <w:t xml:space="preserve">Hệ thống định nghĩa 23 nhóm quyền (người dùng, chức vụ, công ty, nhóm hàng, kho, thẻ, hàng hoá, giá, định mức, khách hàng, nhà cung cấp, tồn kho, phiếu kho, kiểm kê, đơn nhập hàng, đơn bán hàng, xe, chuyến giao hàng, lệnh sản xuất, công nợ, phiếu thu chi, tổng quan, báo cáo) — xem ATL-23.</w:t>
+        <w:t xml:space="preserve">Hệ thống định nghĩa 24 nhóm quyền (người dùng, chức vụ, công ty, nhóm hàng, kho, thẻ, hàng hoá, giá, định mức, khách hàng, nhà cung cấp, tồn kho, phiếu kho, kiểm kê, đơn nhập hàng, đơn bán hàng, xe, chuyến giao hàng, lệnh sản xuất, công nợ, phiếu thu chi, tổng quan, báo cáo, nhật ký hoạt động) — xem ATL-23.</w:t>
       </w:r>
     </w:p>
     <w:p>
@@ -730,7 +730,7 @@
           <w:sz w:val="19"/>
           <w:szCs w:val="19"/>
         </w:rPr>
-        <w:t xml:space="preserve">Lưu ý: các mã quyền là danh mục đã định nghĩa (xem ATL-23); giao diện hiện chưa kiểm tra quyền — mọi tài khoản đăng nhập đều xem và dùng được mọi chức năng.</w:t>
+        <w:t xml:space="preserve">Lưu ý: quyền được kiểm tra ở cả hai nơi — giao diện ẩn trang, mục menu và nút mà chức vụ không có quyền; máy chủ kiểm tra lại ở mọi API (thiếu quyền thì báo "Chức vụ của bạn chưa có quyền…"). Danh mục quyền: ATL-23.</w:t>
       </w:r>
     </w:p>
     <w:p>
@@ -8428,7 +8428,7 @@
                 <w:sz w:val="19"/>
                 <w:szCs w:val="19"/>
               </w:rPr>
-              <w:t xml:space="preserve">ATL-01 → ATL-24</w:t>
+              <w:t xml:space="preserve">ATL-01 → ATL-27</w:t>
             </w:r>
           </w:p>
         </w:tc>
@@ -12505,7 +12505,7 @@
           <w:sz w:val="21"/>
           <w:szCs w:val="21"/>
         </w:rPr>
-        <w:t xml:space="preserve"/>
+        <w:t xml:space="preserve">Mọi thao tác ghi đi qua API của máy chủ và được ghi vào </w:t>
       </w:r>
       <w:r>
         <w:rPr>
@@ -12515,7 +12515,7 @@
           <w:sz w:val="21"/>
           <w:szCs w:val="21"/>
         </w:rPr>
-        <w:t xml:space="preserve">Mọi thao tác ghi đi qua service</w:t>
+        <w:t xml:space="preserve">Nhật ký hoạt động</w:t>
       </w:r>
       <w:r>
         <w:rPr>
@@ -12523,7 +12523,7 @@
           <w:sz w:val="21"/>
           <w:szCs w:val="21"/>
         </w:rPr>
-        <w:t xml:space="preserve">, ánh xạ 1:1 sang endpoint backend sau này; dữ liệu demo sinh từ tools/gen-demo-data.mjs.</w:t>
+        <w:t xml:space="preserve"> trong cùng giao dịch: ai, lúc nào (đến giây), chứng từ nào, trường nào đổi từ giá trị nào sang giá trị nào. Không ai sửa hay xoá được nhật ký (ATL-27).</w:t>
       </w:r>
     </w:p>
     <w:p>
@@ -16219,6 +16219,135 @@
           </w:p>
         </w:tc>
       </w:tr>
+      <w:tr>
+        <w:trPr>
+          <w:cantSplit/>
+        </w:trPr>
+        <w:tc>
+          <w:tcPr>
+            <w:tcW w:type="dxa" w:w="1003"/>
+            <w:tcBorders>
+              <w:top w:val="single" w:color="A6A6A6" w:sz="4"/>
+              <w:left w:val="single" w:color="A6A6A6" w:sz="4"/>
+              <w:bottom w:val="single" w:color="A6A6A6" w:sz="4"/>
+              <w:right w:val="single" w:color="A6A6A6" w:sz="4"/>
+            </w:tcBorders>
+            <w:tcMar>
+              <w:top w:type="dxa" w:w="60"/>
+              <w:left w:type="dxa" w:w="100"/>
+              <w:bottom w:type="dxa" w:w="60"/>
+              <w:right w:type="dxa" w:w="100"/>
+            </w:tcMar>
+            <w:vAlign w:val="top"/>
+          </w:tcPr>
+          <w:p>
+            <w:pPr>
+              <w:spacing w:after="20" w:line="270"/>
+            </w:pPr>
+            <w:r>
+              <w:rPr>
+                <w:rFonts w:ascii="Arial" w:cs="Arial" w:eastAsia="Arial" w:hAnsi="Arial"/>
+                <w:sz w:val="19"/>
+                <w:szCs w:val="19"/>
+              </w:rPr>
+              <w:t xml:space="preserve">ATL-27</w:t>
+            </w:r>
+          </w:p>
+        </w:tc>
+        <w:tc>
+          <w:tcPr>
+            <w:tcW w:type="dxa" w:w="3413"/>
+            <w:tcBorders>
+              <w:top w:val="single" w:color="A6A6A6" w:sz="4"/>
+              <w:left w:val="single" w:color="A6A6A6" w:sz="4"/>
+              <w:bottom w:val="single" w:color="A6A6A6" w:sz="4"/>
+              <w:right w:val="single" w:color="A6A6A6" w:sz="4"/>
+            </w:tcBorders>
+            <w:tcMar>
+              <w:top w:type="dxa" w:w="60"/>
+              <w:left w:type="dxa" w:w="100"/>
+              <w:bottom w:type="dxa" w:w="60"/>
+              <w:right w:type="dxa" w:w="100"/>
+            </w:tcMar>
+            <w:vAlign w:val="top"/>
+          </w:tcPr>
+          <w:p>
+            <w:pPr>
+              <w:spacing w:after="20" w:line="270"/>
+            </w:pPr>
+            <w:r>
+              <w:rPr>
+                <w:rFonts w:ascii="Arial" w:cs="Arial" w:eastAsia="Arial" w:hAnsi="Arial"/>
+                <w:sz w:val="19"/>
+                <w:szCs w:val="19"/>
+              </w:rPr>
+              <w:t xml:space="preserve">Nhật ký hoạt động</w:t>
+            </w:r>
+          </w:p>
+        </w:tc>
+        <w:tc>
+          <w:tcPr>
+            <w:tcW w:type="dxa" w:w="1807"/>
+            <w:tcBorders>
+              <w:top w:val="single" w:color="A6A6A6" w:sz="4"/>
+              <w:left w:val="single" w:color="A6A6A6" w:sz="4"/>
+              <w:bottom w:val="single" w:color="A6A6A6" w:sz="4"/>
+              <w:right w:val="single" w:color="A6A6A6" w:sz="4"/>
+            </w:tcBorders>
+            <w:tcMar>
+              <w:top w:type="dxa" w:w="60"/>
+              <w:left w:type="dxa" w:w="100"/>
+              <w:bottom w:type="dxa" w:w="60"/>
+              <w:right w:type="dxa" w:w="100"/>
+            </w:tcMar>
+            <w:vAlign w:val="top"/>
+          </w:tcPr>
+          <w:p>
+            <w:pPr>
+              <w:spacing w:after="20" w:line="270"/>
+            </w:pPr>
+            <w:r>
+              <w:rPr>
+                <w:rFonts w:ascii="Arial" w:cs="Arial" w:eastAsia="Arial" w:hAnsi="Arial"/>
+                <w:sz w:val="19"/>
+                <w:szCs w:val="19"/>
+              </w:rPr>
+              <w:t xml:space="preserve">Thiết lập</w:t>
+            </w:r>
+          </w:p>
+        </w:tc>
+        <w:tc>
+          <w:tcPr>
+            <w:tcW w:type="dxa" w:w="3415"/>
+            <w:tcBorders>
+              <w:top w:val="single" w:color="A6A6A6" w:sz="4"/>
+              <w:left w:val="single" w:color="A6A6A6" w:sz="4"/>
+              <w:bottom w:val="single" w:color="A6A6A6" w:sz="4"/>
+              <w:right w:val="single" w:color="A6A6A6" w:sz="4"/>
+            </w:tcBorders>
+            <w:tcMar>
+              <w:top w:type="dxa" w:w="60"/>
+              <w:left w:type="dxa" w:w="100"/>
+              <w:bottom w:type="dxa" w:w="60"/>
+              <w:right w:type="dxa" w:w="100"/>
+            </w:tcMar>
+            <w:vAlign w:val="top"/>
+          </w:tcPr>
+          <w:p>
+            <w:pPr>
+              <w:spacing w:after="20" w:line="270"/>
+            </w:pPr>
+            <w:r>
+              <w:rPr>
+                <w:rFonts w:ascii="Arial" w:cs="Arial" w:eastAsia="Arial" w:hAnsi="Arial"/>
+                <w:sz w:val="19"/>
+                <w:szCs w:val="19"/>
+              </w:rPr>
+              <w:t xml:space="preserve">/thiet-lap/nhat-ky</w:t>
+            </w:r>
+          </w:p>
+        </w:tc>
+      </w:tr>
     </w:tbl>
     <w:p>
       <w:pPr>
@@ -16253,7 +16382,7 @@
           <w:sz w:val="21"/>
           <w:szCs w:val="21"/>
         </w:rPr>
-        <w:t xml:space="preserve">Dữ liệu và luồng đang chạy trên bộ nhớ trình duyệt; backend NestJS + Prisma chưa nối. Khi nối, mỗi service ánh xạ 1:1 sang endpoint.</w:t>
+        <w:t xml:space="preserve">Hệ thống chạy trên máy chủ: giao diện Angular gọi API NestJS, dữ liệu lưu ở PostgreSQL; bản triển khai hiện dùng Render (ứng dụng) và Neon (cơ sở dữ liệu). Đăng nhập, phân quyền và nhật ký đều do máy chủ thực hiện.</w:t>
       </w:r>
     </w:p>
     <w:p>
@@ -16271,7 +16400,7 @@
           <w:sz w:val="21"/>
           <w:szCs w:val="21"/>
         </w:rPr>
-        <w:t xml:space="preserve">Báo cáo: 15 / 21 báo cáo đã chạy, 6 báo cáo còn nhãn "Sắp có" (ATL-03).</w:t>
+        <w:t xml:space="preserve">Báo cáo: 19 / 21 báo cáo đã chạy; còn 2 báo cáo nhãn "Sắp có": Giao hàng và Hiệu quả theo tài xế (ATL-03).</w:t>
       </w:r>
     </w:p>
     <w:p>
@@ -16289,7 +16418,25 @@
           <w:sz w:val="21"/>
           <w:szCs w:val="21"/>
         </w:rPr>
-        <w:t xml:space="preserve">Vai trò ở trên lấy từ mô tả chức vụ trong hệ thống. Việc giới hạn theo vai trò (ví dụ ẩn giá vốn với Sale, Thủ kho) mới là định nghĩa, chưa được giao diện áp dụng.</w:t>
+        <w:t xml:space="preserve">Bản 1.1 (23/10/2026): cập nhật theo hệ thống đã nối máy chủ — đăng nhập và phân quyền thật, Nhật ký hoạt động (ATL-27, mới), Tổng quan và Báo cáo thiết kế lại, thêm 4 báo cáo: Hàng không phát sinh lâu ngày, Thẻ kho, Vòng quay tồn kho, Giá mua biến động.</w:t>
+      </w:r>
+    </w:p>
+    <w:p>
+      <w:pPr>
+        <w:pStyle w:val="ListParagraph"/>
+        <w:numPr>
+          <w:ilvl w:val="0"/>
+          <w:numId w:val="2"/>
+        </w:numPr>
+        <w:spacing w:after="60" w:line="290"/>
+      </w:pPr>
+      <w:r>
+        <w:rPr>
+          <w:rFonts w:ascii="Arial" w:cs="Arial" w:eastAsia="Arial" w:hAnsi="Arial"/>
+          <w:sz w:val="21"/>
+          <w:szCs w:val="21"/>
+        </w:rPr>
+        <w:t xml:space="preserve">Vai trò ở trên lấy từ mô tả chức vụ trong hệ thống. Quyền theo chức vụ đã được áp ở giao diện và máy chủ; riêng quyền Xem giá vốn (ẩn giá vốn với Sale, Thủ kho) mới là định nghĩa, chưa áp dụng.</w:t>
       </w:r>
     </w:p>
     <w:p>
@@ -16325,7 +16472,7 @@
           <w:sz w:val="21"/>
           <w:szCs w:val="21"/>
         </w:rPr>
-        <w:t xml:space="preserve">Hệ thống hiện chạy trên dữ liệu mô phỏng (mock) trong trình duyệt; các quy tắc dưới đây là hành vi đã cài đặt ở giao diện và sẽ ánh xạ 1:1 sang API backend.</w:t>
+        <w:t xml:space="preserve">Dữ liệu được lưu ở máy chủ (cơ sở dữ liệu PostgreSQL) và đọc / ghi qua API; các quy tắc nghiệp vụ trong tài liệu này được áp ở máy chủ, giao diện báo lỗi sớm cho người dùng. Mỗi thao tác ghi để lại một dòng Nhật ký hoạt động (ATL-27).</w:t>
       </w:r>
     </w:p>
     <w:sectPr>

</xml_diff>